<commit_message>
docs: update DOCX versions of documentation and knowledge base
</commit_message>
<xml_diff>
--- a/PRODUCT_DOCUMENTATION.docx
+++ b/PRODUCT_DOCUMENTATION.docx
@@ -5116,6 +5116,54 @@
     </w:p>
     <w:p>
       <w:pPr>
+        <w:pStyle w:val="Heading4"/>
+      </w:pPr>
+      <w:r>
+        <w:t>Installations Tab</w:t>
+      </w:r>
+    </w:p>
+    <w:p>
+      <w:pPr>
+        <w:pStyle w:val="ListBullet"/>
+      </w:pPr>
+      <w:r>
+        <w:t>End-of-Lifecycle Management: Record the final installation of devices at customer sites.</w:t>
+      </w:r>
+    </w:p>
+    <w:p>
+      <w:pPr>
+        <w:pStyle w:val="ListBullet"/>
+      </w:pPr>
+      <w:r>
+        <w:t>Scanning Integration: Barcode scanning to quickly identify devices for installation.</w:t>
+      </w:r>
+    </w:p>
+    <w:p>
+      <w:pPr>
+        <w:pStyle w:val="ListBullet"/>
+      </w:pPr>
+      <w:r>
+        <w:t>Status Updates: Automatically updates device status to 'Installed' and holder to 'Customer'.</w:t>
+      </w:r>
+    </w:p>
+    <w:p>
+      <w:pPr>
+        <w:pStyle w:val="ListBullet"/>
+      </w:pPr>
+      <w:r>
+        <w:t>Movement Logging: Creates an audit trail of the installation movement.</w:t>
+      </w:r>
+    </w:p>
+    <w:p>
+      <w:pPr>
+        <w:pStyle w:val="ListBullet"/>
+      </w:pPr>
+      <w:r>
+        <w:t>History View: View a log of recent installations.</w:t>
+      </w:r>
+    </w:p>
+    <w:p>
+      <w:pPr>
         <w:spacing w:after="120"/>
       </w:pPr>
       <w:r>
@@ -6084,6 +6132,1350 @@
     </w:p>
     <w:p>
       <w:pPr>
+        <w:pStyle w:val="Heading3"/>
+      </w:pPr>
+      <w:r>
+        <w:t>15. Xlink-Sage (AI-Powered System Guide)</w:t>
+      </w:r>
+    </w:p>
+    <w:p>
+      <w:pPr>
+        <w:spacing w:after="120"/>
+      </w:pPr>
+      <w:r>
+        <w:t>Purpose: Intelligent, context-aware chatbot that serves as an "Old Sage of Inventory Wisdom" - providing instant answers to user questions by searching through comprehensive system documentation using AI-powered vector similarity search.</w:t>
+      </w:r>
+    </w:p>
+    <w:p>
+      <w:pPr>
+        <w:spacing w:after="120"/>
+      </w:pPr>
+      <w:r>
+        <w:t>Feature Implementation Status: Fully implemented with conversation memory, role-based responses, and navigable links</w:t>
+      </w:r>
+    </w:p>
+    <w:p>
+      <w:pPr>
+        <w:pStyle w:val="Heading4"/>
+      </w:pPr>
+      <w:r>
+        <w:t>Key Features</w:t>
+      </w:r>
+    </w:p>
+    <w:p>
+      <w:pPr>
+        <w:spacing w:after="120"/>
+      </w:pPr>
+      <w:r>
+        <w:t>Conversational Intelligence:</w:t>
+      </w:r>
+    </w:p>
+    <w:p>
+      <w:pPr>
+        <w:pStyle w:val="ListBullet"/>
+      </w:pPr>
+      <w:r>
+        <w:t>Conversation Memory: Remembers the last 5 message exchanges in each session for natural multi-turn interactions</w:t>
+      </w:r>
+    </w:p>
+    <w:p>
+      <w:pPr>
+        <w:pStyle w:val="ListBullet"/>
+      </w:pPr>
+      <w:r>
+        <w:t>Session Persistence: Conversations persist across page refreshes using localStorage</w:t>
+      </w:r>
+    </w:p>
+    <w:p>
+      <w:pPr>
+        <w:pStyle w:val="ListBullet"/>
+      </w:pPr>
+      <w:r>
+        <w:t>Context-Aware: Maintains conversation context to understand follow-up questions</w:t>
+      </w:r>
+    </w:p>
+    <w:p>
+      <w:pPr>
+        <w:pStyle w:val="ListBullet"/>
+      </w:pPr>
+      <w:r>
+        <w:t>Smart Persona: Responds in plain, jargon-free language with light wit and sage-like wisdom</w:t>
+      </w:r>
+    </w:p>
+    <w:p>
+      <w:pPr>
+        <w:spacing w:after="120"/>
+      </w:pPr>
+      <w:r>
+        <w:t>Knowledge Retrieval:</w:t>
+      </w:r>
+    </w:p>
+    <w:p>
+      <w:pPr>
+        <w:pStyle w:val="ListBullet"/>
+      </w:pPr>
+      <w:r>
+        <w:t>Vector Similarity Search: Uses OpenAI embeddings (text-embedding-3-small) to find the most relevant documentation</w:t>
+      </w:r>
+    </w:p>
+    <w:p>
+      <w:pPr>
+        <w:pStyle w:val="ListBullet"/>
+      </w:pPr>
+      <w:r>
+        <w:t>Real-time Context: Searches knowledge base in real-time for every query</w:t>
+      </w:r>
+    </w:p>
+    <w:p>
+      <w:pPr>
+        <w:pStyle w:val="ListBullet"/>
+      </w:pPr>
+      <w:r>
+        <w:t>Source Attribution: Shows which documentation sections were used in the response</w:t>
+      </w:r>
+    </w:p>
+    <w:p>
+      <w:pPr>
+        <w:pStyle w:val="ListBullet"/>
+      </w:pPr>
+      <w:r>
+        <w:t>Accuracy-First: Only provides information from actual documentation - never guesses or makes up answers</w:t>
+      </w:r>
+    </w:p>
+    <w:p>
+      <w:pPr>
+        <w:spacing w:after="120"/>
+      </w:pPr>
+      <w:r>
+        <w:t>Role-Based Guidance:</w:t>
+      </w:r>
+    </w:p>
+    <w:p>
+      <w:pPr>
+        <w:pStyle w:val="ListBullet"/>
+      </w:pPr>
+      <w:r>
+        <w:t>Admin Users: Advanced tips about 90-day forecasting, user management, approval workflows, and system configuration</w:t>
+      </w:r>
+    </w:p>
+    <w:p>
+      <w:pPr>
+        <w:pStyle w:val="ListBullet"/>
+      </w:pPr>
+      <w:r>
+        <w:t>Back Office Users: Focus on order management, reporting, asset tracking, KPI dashboard, and picking queue operations</w:t>
+      </w:r>
+    </w:p>
+    <w:p>
+      <w:pPr>
+        <w:pStyle w:val="ListBullet"/>
+      </w:pPr>
+      <w:r>
+        <w:t>Field Users: Mobile-friendly workflows like stock ordering, barcode scanning, stock counts, device tracking, and repair logging</w:t>
+      </w:r>
+    </w:p>
+    <w:p>
+      <w:pPr>
+        <w:pStyle w:val="ListBullet"/>
+      </w:pPr>
+      <w:r>
+        <w:t>User Context: Automatically detects user profile (role, warehouse, company) and personalizes responses</w:t>
+      </w:r>
+    </w:p>
+    <w:p>
+      <w:pPr>
+        <w:spacing w:after="120"/>
+      </w:pPr>
+      <w:r>
+        <w:t>Navigable Links:</w:t>
+      </w:r>
+    </w:p>
+    <w:p>
+      <w:pPr>
+        <w:pStyle w:val="ListBullet"/>
+      </w:pPr>
+      <w:r>
+        <w:t>In-App Navigation: Bot responses can include clickable buttons using syntax [NAVIGATE:Label|/path]</w:t>
+      </w:r>
+    </w:p>
+    <w:p>
+      <w:pPr>
+        <w:pStyle w:val="ListBullet"/>
+      </w:pPr>
+      <w:r>
+        <w:t>Quick Access: Direct navigation to relevant pages like /stock-order, /kpi, /user-management, /tracking</w:t>
+      </w:r>
+    </w:p>
+    <w:p>
+      <w:pPr>
+        <w:pStyle w:val="ListBullet"/>
+      </w:pPr>
+      <w:r>
+        <w:t>Seamless Flow: Users can ask "How do I create an order?" and click a button to go directly to the order page</w:t>
+      </w:r>
+    </w:p>
+    <w:p>
+      <w:pPr>
+        <w:spacing w:after="120"/>
+      </w:pPr>
+      <w:r>
+        <w:t>System-Specific Guidance:</w:t>
+      </w:r>
+    </w:p>
+    <w:p>
+      <w:pPr>
+        <w:pStyle w:val="ListBullet"/>
+      </w:pPr>
+      <w:r>
+        <w:t>Dropdown Instructions: Guides users to "select the appropriate option" instead of hardcoding dropdown values</w:t>
+      </w:r>
+    </w:p>
+    <w:p>
+      <w:pPr>
+        <w:pStyle w:val="ListBullet"/>
+      </w:pPr>
+      <w:r>
+        <w:t>Workflow Assistance: Understands all system workflows (orders, picking, dispatch, assets, repairs, stock counts)</w:t>
+      </w:r>
+    </w:p>
+    <w:p>
+      <w:pPr>
+        <w:pStyle w:val="ListBullet"/>
+      </w:pPr>
+      <w:r>
+        <w:t>Best Practices: Provides context-aware tips based on user role and current workflow</w:t>
+      </w:r>
+    </w:p>
+    <w:p>
+      <w:pPr>
+        <w:pStyle w:val="Heading4"/>
+      </w:pPr>
+      <w:r>
+        <w:t>Technical Architecture</w:t>
+      </w:r>
+    </w:p>
+    <w:p>
+      <w:pPr>
+        <w:spacing w:after="120"/>
+      </w:pPr>
+      <w:r>
+        <w:t>Frontend Component: src/components/SystemGuideBot.tsx</w:t>
+      </w:r>
+    </w:p>
+    <w:p>
+      <w:pPr>
+        <w:pStyle w:val="ListBullet"/>
+      </w:pPr>
+      <w:r>
+        <w:t>Session ID generation for conversation isolation</w:t>
+      </w:r>
+    </w:p>
+    <w:p>
+      <w:pPr>
+        <w:pStyle w:val="ListBullet"/>
+      </w:pPr>
+      <w:r>
+        <w:t>localStorage-based conversation history (last 5 exchanges)</w:t>
+      </w:r>
+    </w:p>
+    <w:p>
+      <w:pPr>
+        <w:pStyle w:val="ListBullet"/>
+      </w:pPr>
+      <w:r>
+        <w:t>Auto-save on message changes</w:t>
+      </w:r>
+    </w:p>
+    <w:p>
+      <w:pPr>
+        <w:pStyle w:val="ListBullet"/>
+      </w:pPr>
+      <w:r>
+        <w:t>Supports both direct Netlify function and n8n fallback</w:t>
+      </w:r>
+    </w:p>
+    <w:p>
+      <w:pPr>
+        <w:pStyle w:val="ListBullet"/>
+      </w:pPr>
+      <w:r>
+        <w:t>Navigable link parsing with regex</w:t>
+      </w:r>
+    </w:p>
+    <w:p>
+      <w:pPr>
+        <w:pStyle w:val="ListBullet"/>
+      </w:pPr>
+      <w:r>
+        <w:t>User context extraction from profile</w:t>
+      </w:r>
+    </w:p>
+    <w:p>
+      <w:pPr>
+        <w:pStyle w:val="ListBullet"/>
+      </w:pPr>
+      <w:r>
+        <w:t>Error handling with user-friendly messages</w:t>
+      </w:r>
+    </w:p>
+    <w:p>
+      <w:pPr>
+        <w:spacing w:after="120"/>
+      </w:pPr>
+      <w:r>
+        <w:t>Backend Function: netlify/functions/chat.js</w:t>
+      </w:r>
+    </w:p>
+    <w:p>
+      <w:pPr>
+        <w:spacing w:after="120"/>
+      </w:pPr>
+      <w:r>
+        <w:t>Workflow:</w:t>
+      </w:r>
+    </w:p>
+    <w:p>
+      <w:pPr>
+        <w:spacing w:after="120"/>
+      </w:pPr>
+      <w:r>
+        <w:t>1. Receive user message + conversation history + user context</w:t>
+      </w:r>
+    </w:p>
+    <w:p>
+      <w:pPr>
+        <w:spacing w:after="120"/>
+      </w:pPr>
+      <w:r>
+        <w:t>2. Generate embedding using OpenAI (text-embedding-3-small)</w:t>
+      </w:r>
+    </w:p>
+    <w:p>
+      <w:pPr>
+        <w:spacing w:after="120"/>
+      </w:pPr>
+      <w:r>
+        <w:t>3. Search Supabase for similar documents using pgvector</w:t>
+      </w:r>
+    </w:p>
+    <w:p>
+      <w:pPr>
+        <w:spacing w:after="120"/>
+      </w:pPr>
+      <w:r>
+        <w:t>4. Format context from top 5 matching documents</w:t>
+      </w:r>
+    </w:p>
+    <w:p>
+      <w:pPr>
+        <w:spacing w:after="120"/>
+      </w:pPr>
+      <w:r>
+        <w:t>5. Generate response using OpenAI (gpt-4o-mini) with:</w:t>
+      </w:r>
+    </w:p>
+    <w:p>
+      <w:pPr>
+        <w:spacing w:after="120"/>
+      </w:pPr>
+      <w:r>
+        <w:t>- System prompt (Xlink-Sage persona with role-specific guidance)</w:t>
+      </w:r>
+    </w:p>
+    <w:p>
+      <w:pPr>
+        <w:spacing w:after="120"/>
+      </w:pPr>
+      <w:r>
+        <w:t>- Conversation history (last 5 exchanges)</w:t>
+      </w:r>
+    </w:p>
+    <w:p>
+      <w:pPr>
+        <w:spacing w:after="120"/>
+      </w:pPr>
+      <w:r>
+        <w:t>- Retrieved knowledge context</w:t>
+      </w:r>
+    </w:p>
+    <w:p>
+      <w:pPr>
+        <w:spacing w:after="120"/>
+      </w:pPr>
+      <w:r>
+        <w:t>- Current user message</w:t>
+      </w:r>
+    </w:p>
+    <w:p>
+      <w:pPr>
+        <w:spacing w:after="120"/>
+      </w:pPr>
+      <w:r>
+        <w:t>6. Return answer + sources</w:t>
+      </w:r>
+    </w:p>
+    <w:p>
+      <w:pPr>
+        <w:spacing w:after="120"/>
+      </w:pPr>
+      <w:r>
+        <w:t>Knowledge Base Sources:</w:t>
+      </w:r>
+    </w:p>
+    <w:p>
+      <w:pPr>
+        <w:pStyle w:val="ListBullet"/>
+      </w:pPr>
+      <w:r>
+        <w:t>PRODUCT_DOCUMENTATION.md: Complete product documentation (70 chunks)</w:t>
+      </w:r>
+    </w:p>
+    <w:p>
+      <w:pPr>
+        <w:pStyle w:val="ListBullet"/>
+      </w:pPr>
+      <w:r>
+        <w:t>KNOWLEDGEBASEWORKFLOW_GUIDE.md: Step-by-step workflows (75 chunks)</w:t>
+      </w:r>
+    </w:p>
+    <w:p>
+      <w:pPr>
+        <w:spacing w:after="120"/>
+      </w:pPr>
+      <w:r>
+        <w:t>Update Process:</w:t>
+      </w:r>
+    </w:p>
+    <w:p>
+      <w:pPr>
+        <w:spacing w:after="120"/>
+      </w:pPr>
+      <w:r>
+        <w:t>1. Edit documentation markdown files</w:t>
+      </w:r>
+    </w:p>
+    <w:p>
+      <w:pPr>
+        <w:spacing w:after="120"/>
+      </w:pPr>
+      <w:r>
+        <w:t>2. Run ingestion script: python scripts/ingest_documents.py</w:t>
+      </w:r>
+    </w:p>
+    <w:p>
+      <w:pPr>
+        <w:spacing w:after="120"/>
+      </w:pPr>
+      <w:r>
+        <w:t>3. Documents automatically chunked and embedded using LangChain</w:t>
+      </w:r>
+    </w:p>
+    <w:p>
+      <w:pPr>
+        <w:spacing w:after="120"/>
+      </w:pPr>
+      <w:r>
+        <w:t>4. Bot uses updated information immediately on next query</w:t>
+      </w:r>
+    </w:p>
+    <w:p>
+      <w:pPr>
+        <w:pStyle w:val="Heading4"/>
+      </w:pPr>
+      <w:r>
+        <w:t>Bot Analytics &amp; Usage Tracking</w:t>
+      </w:r>
+    </w:p>
+    <w:p>
+      <w:pPr>
+        <w:spacing w:after="120"/>
+      </w:pPr>
+      <w:r>
+        <w:t>Database Table: botusagelogs</w:t>
+      </w:r>
+    </w:p>
+    <w:p>
+      <w:pPr>
+        <w:spacing w:after="120"/>
+      </w:pPr>
+      <w:r>
+        <w:t>Comprehensive analytics system tracks all bot interactions for insights and improvements:</w:t>
+      </w:r>
+    </w:p>
+    <w:p>
+      <w:pPr>
+        <w:spacing w:after="120"/>
+      </w:pPr>
+      <w:r>
+        <w:t>Column | Type | Description</w:t>
+      </w:r>
+    </w:p>
+    <w:p>
+      <w:pPr>
+        <w:spacing w:after="120"/>
+      </w:pPr>
+      <w:r>
+        <w:t>id | UUID | Primary key</w:t>
+      </w:r>
+    </w:p>
+    <w:p>
+      <w:pPr>
+        <w:spacing w:after="120"/>
+      </w:pPr>
+      <w:r>
+        <w:t>userid | UUID | References userprofiles(id)</w:t>
+      </w:r>
+    </w:p>
+    <w:p>
+      <w:pPr>
+        <w:spacing w:after="120"/>
+      </w:pPr>
+      <w:r>
+        <w:t>user_email | TEXT | User email for reporting</w:t>
+      </w:r>
+    </w:p>
+    <w:p>
+      <w:pPr>
+        <w:spacing w:after="120"/>
+      </w:pPr>
+      <w:r>
+        <w:t>userrole | TEXT | admin, backoffice, user</w:t>
+      </w:r>
+    </w:p>
+    <w:p>
+      <w:pPr>
+        <w:spacing w:after="120"/>
+      </w:pPr>
+      <w:r>
+        <w:t>user_company | TEXT | Company name</w:t>
+      </w:r>
+    </w:p>
+    <w:p>
+      <w:pPr>
+        <w:spacing w:after="120"/>
+      </w:pPr>
+      <w:r>
+        <w:t>user_warehouse | TEXT | Warehouse location</w:t>
+      </w:r>
+    </w:p>
+    <w:p>
+      <w:pPr>
+        <w:spacing w:after="120"/>
+      </w:pPr>
+      <w:r>
+        <w:t>session_id | TEXT | Conversation session identifier</w:t>
+      </w:r>
+    </w:p>
+    <w:p>
+      <w:pPr>
+        <w:spacing w:after="120"/>
+      </w:pPr>
+      <w:r>
+        <w:t>query | TEXT | User's question</w:t>
+      </w:r>
+    </w:p>
+    <w:p>
+      <w:pPr>
+        <w:spacing w:after="120"/>
+      </w:pPr>
+      <w:r>
+        <w:t>response | TEXT | Bot's answer</w:t>
+      </w:r>
+    </w:p>
+    <w:p>
+      <w:pPr>
+        <w:spacing w:after="120"/>
+      </w:pPr>
+      <w:r>
+        <w:t>sources | JSONB | Documentation sources used</w:t>
+      </w:r>
+    </w:p>
+    <w:p>
+      <w:pPr>
+        <w:spacing w:after="120"/>
+      </w:pPr>
+      <w:r>
+        <w:t>tokens_used | INTEGER | OpenAI tokens consumed</w:t>
+      </w:r>
+    </w:p>
+    <w:p>
+      <w:pPr>
+        <w:spacing w:after="120"/>
+      </w:pPr>
+      <w:r>
+        <w:t>responsetimems | INTEGER | Response latency</w:t>
+      </w:r>
+    </w:p>
+    <w:p>
+      <w:pPr>
+        <w:spacing w:after="120"/>
+      </w:pPr>
+      <w:r>
+        <w:t>isworkrelated | BOOLEAN | Query classification</w:t>
+      </w:r>
+    </w:p>
+    <w:p>
+      <w:pPr>
+        <w:spacing w:after="120"/>
+      </w:pPr>
+      <w:r>
+        <w:t>satisfaction_rating | INTEGER | 1-5 star rating</w:t>
+      </w:r>
+    </w:p>
+    <w:p>
+      <w:pPr>
+        <w:spacing w:after="120"/>
+      </w:pPr>
+      <w:r>
+        <w:t>satisfaction_feedback | TEXT | User feedback comments</w:t>
+      </w:r>
+    </w:p>
+    <w:p>
+      <w:pPr>
+        <w:spacing w:after="120"/>
+      </w:pPr>
+      <w:r>
+        <w:t>created_at | TIMESTAMPTZ | Query timestamp</w:t>
+      </w:r>
+    </w:p>
+    <w:p>
+      <w:pPr>
+        <w:spacing w:after="120"/>
+      </w:pPr>
+      <w:r>
+        <w:t>rated_at | TIMESTAMPTZ | Rating timestamp</w:t>
+      </w:r>
+    </w:p>
+    <w:p>
+      <w:pPr>
+        <w:spacing w:after="120"/>
+      </w:pPr>
+      <w:r>
+        <w:t>Metrics Captured:</w:t>
+      </w:r>
+    </w:p>
+    <w:p>
+      <w:pPr>
+        <w:spacing w:after="120"/>
+      </w:pPr>
+      <w:r>
+        <w:t>1. Usage Metrics: Total queries per period, queries per user, peak usage times, average response time, token consumption</w:t>
+      </w:r>
+    </w:p>
+    <w:p>
+      <w:pPr>
+        <w:spacing w:after="120"/>
+      </w:pPr>
+      <w:r>
+        <w:t>2. Quality Metrics: User satisfaction ratings (1-5 stars), satisfaction feedback text, most helpful responses, common question patterns</w:t>
+      </w:r>
+    </w:p>
+    <w:p>
+      <w:pPr>
+        <w:spacing w:after="120"/>
+      </w:pPr>
+      <w:r>
+        <w:t>3. Work Classification: Work-related vs. non-work queries, most common work topics, off-topic usage patterns</w:t>
+      </w:r>
+    </w:p>
+    <w:p>
+      <w:pPr>
+        <w:spacing w:after="120"/>
+      </w:pPr>
+      <w:r>
+        <w:t>4. User Insights: Top users by query count, role-specific usage patterns, question types by role, time to resolution</w:t>
+      </w:r>
+    </w:p>
+    <w:p>
+      <w:pPr>
+        <w:spacing w:after="120"/>
+      </w:pPr>
+      <w:r>
+        <w:t>KPI Dashboard Integration: Dedicated "Xlink-Sage Analytics" tab displays:</w:t>
+      </w:r>
+    </w:p>
+    <w:p>
+      <w:pPr>
+        <w:pStyle w:val="ListBullet"/>
+      </w:pPr>
+      <w:r>
+        <w:t>Overview Cards: Total queries this month, average satisfaction rating, most active user, total sessions</w:t>
+      </w:r>
+    </w:p>
+    <w:p>
+      <w:pPr>
+        <w:pStyle w:val="ListBullet"/>
+      </w:pPr>
+      <w:r>
+        <w:t>Usage Trends (Line Chart): Queries over time, satisfaction ratings trend, work vs. non-work split</w:t>
+      </w:r>
+    </w:p>
+    <w:p>
+      <w:pPr>
+        <w:pStyle w:val="ListBullet"/>
+      </w:pPr>
+      <w:r>
+        <w:t>Top Questions (Table): Most frequently asked questions, average satisfaction per question type, response time per question type</w:t>
+      </w:r>
+    </w:p>
+    <w:p>
+      <w:pPr>
+        <w:pStyle w:val="ListBullet"/>
+      </w:pPr>
+      <w:r>
+        <w:t>User Engagement (Bar Chart): Queries by user role, top 10 users by query count, average queries per session</w:t>
+      </w:r>
+    </w:p>
+    <w:p>
+      <w:pPr>
+        <w:pStyle w:val="ListBullet"/>
+      </w:pPr>
+      <w:r>
+        <w:t>Satisfaction Breakdown (Pie Chart): Distribution of 1-5 star ratings</w:t>
+      </w:r>
+    </w:p>
+    <w:p>
+      <w:pPr>
+        <w:pStyle w:val="ListBullet"/>
+      </w:pPr>
+      <w:r>
+        <w:t>Response Performance (Histogram): Response time distribution, token usage distribution, session length distribution</w:t>
+      </w:r>
+    </w:p>
+    <w:p>
+      <w:pPr>
+        <w:pStyle w:val="ListBullet"/>
+      </w:pPr>
+      <w:r>
+        <w:t>Topic Analysis (Word Cloud): Most common keywords in queries, top documentation sections accessed</w:t>
+      </w:r>
+    </w:p>
+    <w:p>
+      <w:pPr>
+        <w:pStyle w:val="ListBullet"/>
+      </w:pPr>
+      <w:r>
+        <w:t>Work Classification (Donut Chart): Work-related vs. non-work queries percentage</w:t>
+      </w:r>
+    </w:p>
+    <w:p>
+      <w:pPr>
+        <w:spacing w:after="120"/>
+      </w:pPr>
+      <w:r>
+        <w:t>Installations Analytics:</w:t>
+      </w:r>
+    </w:p>
+    <w:p>
+      <w:pPr>
+        <w:pStyle w:val="ListBullet"/>
+      </w:pPr>
+      <w:r>
+        <w:t>Dedicated "Installations" tab in the KPI Dashboard.</w:t>
+      </w:r>
+    </w:p>
+    <w:p>
+      <w:pPr>
+        <w:pStyle w:val="ListBullet"/>
+      </w:pPr>
+      <w:r>
+        <w:t>Currently displays "Awaiting Vendor Information" until analytics requirements are finalized.</w:t>
+      </w:r>
+    </w:p>
+    <w:p>
+      <w:pPr>
+        <w:spacing w:after="120"/>
+      </w:pPr>
+      <w:r>
+        <w:t>Satisfaction Rating UI:</w:t>
+      </w:r>
+    </w:p>
+    <w:p>
+      <w:pPr>
+        <w:pStyle w:val="ListBullet"/>
+      </w:pPr>
+      <w:r>
+        <w:t>After each bot response, users can rate the answer with 1-5 stars</w:t>
+      </w:r>
+    </w:p>
+    <w:p>
+      <w:pPr>
+        <w:pStyle w:val="ListBullet"/>
+      </w:pPr>
+      <w:r>
+        <w:t>Optional feedback textarea appears after rating</w:t>
+      </w:r>
+    </w:p>
+    <w:p>
+      <w:pPr>
+        <w:pStyle w:val="ListBullet"/>
+      </w:pPr>
+      <w:r>
+        <w:t>"Skip" option to dismiss without rating</w:t>
+      </w:r>
+    </w:p>
+    <w:p>
+      <w:pPr>
+        <w:pStyle w:val="ListBullet"/>
+      </w:pPr>
+      <w:r>
+        <w:t>Thank you message after submission</w:t>
+      </w:r>
+    </w:p>
+    <w:p>
+      <w:pPr>
+        <w:pStyle w:val="Heading4"/>
+      </w:pPr>
+      <w:r>
+        <w:t>System Prompt &amp; Persona</w:t>
+      </w:r>
+    </w:p>
+    <w:p>
+      <w:pPr>
+        <w:spacing w:after="120"/>
+      </w:pPr>
+      <w:r>
+        <w:t>The bot operates with a carefully crafted personality:</w:t>
+      </w:r>
+    </w:p>
+    <w:p>
+      <w:pPr>
+        <w:spacing w:after="120"/>
+      </w:pPr>
+      <w:r>
+        <w:t>&gt; "You are Xlink-Sage, a witty but grounded guide to the inventory system. Think of yourself as that friend who's seen it all and can point people in the right direction without the corporate speak.</w:t>
+      </w:r>
+    </w:p>
+    <w:p>
+      <w:pPr>
+        <w:spacing w:after="120"/>
+      </w:pPr>
+      <w:r>
+        <w:t>&gt;</w:t>
+      </w:r>
+    </w:p>
+    <w:p>
+      <w:pPr>
+        <w:spacing w:after="120"/>
+      </w:pPr>
+      <w:r>
+        <w:t>&gt; Your style:</w:t>
+      </w:r>
+    </w:p>
+    <w:p>
+      <w:pPr>
+        <w:spacing w:after="120"/>
+      </w:pPr>
+      <w:r>
+        <w:t>&gt; - Plain talk, no jargon storms. If a 10-year-old can't get it, rephrase it.</w:t>
+      </w:r>
+    </w:p>
+    <w:p>
+      <w:pPr>
+        <w:spacing w:after="120"/>
+      </w:pPr>
+      <w:r>
+        <w:t>&gt; - Witty but not silly. A light touch of humor keeps things human.</w:t>
+      </w:r>
+    </w:p>
+    <w:p>
+      <w:pPr>
+        <w:spacing w:after="120"/>
+      </w:pPr>
+      <w:r>
+        <w:t>&gt; - Sage-like: you know the patterns, you've read the docs, you stick to what's real.</w:t>
+      </w:r>
+    </w:p>
+    <w:p>
+      <w:pPr>
+        <w:spacing w:after="120"/>
+      </w:pPr>
+      <w:r>
+        <w:t>&gt; - Short answers win. Give them the path, not the entire forest.</w:t>
+      </w:r>
+    </w:p>
+    <w:p>
+      <w:pPr>
+        <w:spacing w:after="120"/>
+      </w:pPr>
+      <w:r>
+        <w:t>&gt;</w:t>
+      </w:r>
+    </w:p>
+    <w:p>
+      <w:pPr>
+        <w:spacing w:after="120"/>
+      </w:pPr>
+      <w:r>
+        <w:t>&gt; Your rules:</w:t>
+      </w:r>
+    </w:p>
+    <w:p>
+      <w:pPr>
+        <w:spacing w:after="120"/>
+      </w:pPr>
+      <w:r>
+        <w:t>&gt; - Only say what the docs actually say. No making stuff up, no guessing, no 'probably works like...'</w:t>
+      </w:r>
+    </w:p>
+    <w:p>
+      <w:pPr>
+        <w:spacing w:after="120"/>
+      </w:pPr>
+      <w:r>
+        <w:t>&gt; - If the answer's in the context, give it straight: 'Go here, click this, you'll see that.'</w:t>
+      </w:r>
+    </w:p>
+    <w:p>
+      <w:pPr>
+        <w:spacing w:after="120"/>
+      </w:pPr>
+      <w:r>
+        <w:t>&gt; - If it's not in the context, be honest: 'That's not in my scrolls. Check the guide or ask support.'</w:t>
+      </w:r>
+    </w:p>
+    <w:p>
+      <w:pPr>
+        <w:spacing w:after="120"/>
+      </w:pPr>
+      <w:r>
+        <w:t>&gt; - Keep it friendly but factual. You're helpful, not a salesperson."</w:t>
+      </w:r>
+    </w:p>
+    <w:p>
+      <w:pPr>
+        <w:pStyle w:val="Heading4"/>
+      </w:pPr>
+      <w:r>
+        <w:t>Error Handling</w:t>
+      </w:r>
+    </w:p>
+    <w:p>
+      <w:pPr>
+        <w:spacing w:after="120"/>
+      </w:pPr>
+      <w:r>
+        <w:t>User-friendly error messages for common issues:</w:t>
+      </w:r>
+    </w:p>
+    <w:p>
+      <w:pPr>
+        <w:spacing w:after="120"/>
+      </w:pPr>
+      <w:r>
+        <w:t>Error Type | User-Friendly Message</w:t>
+      </w:r>
+    </w:p>
+    <w:p>
+      <w:pPr>
+        <w:spacing w:after="120"/>
+      </w:pPr>
+      <w:r>
+        <w:t>Quota exceeded | "⚠️ The AI service has reached its usage quota. Please contact your system administrator to add credits at platform.openai.com"</w:t>
+      </w:r>
+    </w:p>
+    <w:p>
+      <w:pPr>
+        <w:spacing w:after="120"/>
+      </w:pPr>
+      <w:r>
+        <w:t>Rate limit | "⏱️ Too many requests at once. Please wait a moment and try again."</w:t>
+      </w:r>
+    </w:p>
+    <w:p>
+      <w:pPr>
+        <w:spacing w:after="120"/>
+      </w:pPr>
+      <w:r>
+        <w:t>Invalid API key | "🔑 The AI service is not properly configured. Please contact your system administrator."</w:t>
+      </w:r>
+    </w:p>
+    <w:p>
+      <w:pPr>
+        <w:spacing w:after="120"/>
+      </w:pPr>
+      <w:r>
+        <w:t>Service unavailable | "🔧 The AI service is temporarily down. Please try again in a few minutes."</w:t>
+      </w:r>
+    </w:p>
+    <w:p>
+      <w:pPr>
+        <w:spacing w:after="120"/>
+      </w:pPr>
+      <w:r>
+        <w:t>Network error | "I couldn't reach the knowledge base. Please try again or contact support."</w:t>
+      </w:r>
+    </w:p>
+    <w:p>
+      <w:pPr>
+        <w:pStyle w:val="Heading4"/>
+      </w:pPr>
+      <w:r>
+        <w:t>Configuration</w:t>
+      </w:r>
+    </w:p>
+    <w:p>
+      <w:pPr>
+        <w:spacing w:after="120"/>
+      </w:pPr>
+      <w:r>
+        <w:t>Environment Variables Required:</w:t>
+      </w:r>
+    </w:p>
+    <w:p>
+      <w:pPr>
+        <w:pStyle w:val="Heading4"/>
+      </w:pPr>
+      <w:r>
+        <w:t>Cost Analysis</w:t>
+      </w:r>
+    </w:p>
+    <w:p>
+      <w:pPr>
+        <w:spacing w:after="120"/>
+      </w:pPr>
+      <w:r>
+        <w:t>Current Usage:</w:t>
+      </w:r>
+    </w:p>
+    <w:p>
+      <w:pPr>
+        <w:pStyle w:val="ListBullet"/>
+      </w:pPr>
+      <w:r>
+        <w:t>Embedding Model: text-embedding-3-small ($0.00002 / 1K tokens)</w:t>
+      </w:r>
+    </w:p>
+    <w:p>
+      <w:pPr>
+        <w:pStyle w:val="ListBullet"/>
+      </w:pPr>
+      <w:r>
+        <w:t>Chat Model: gpt-4o-mini ($0.000150 / 1K input, $0.000600 / 1K output)</w:t>
+      </w:r>
+    </w:p>
+    <w:p>
+      <w:pPr>
+        <w:spacing w:after="120"/>
+      </w:pPr>
+      <w:r>
+        <w:t>Example Monthly Costs (1000 queries):</w:t>
+      </w:r>
+    </w:p>
+    <w:p>
+      <w:pPr>
+        <w:spacing w:after="120"/>
+      </w:pPr>
+      <w:r>
+        <w:t>KPI Dashboard Display:</w:t>
+      </w:r>
+    </w:p>
+    <w:p>
+      <w:pPr>
+        <w:pStyle w:val="ListBullet"/>
+      </w:pPr>
+      <w:r>
+        <w:t>Costs displayed in South African Rand (ZAR) with USD reference</w:t>
+      </w:r>
+    </w:p>
+    <w:p>
+      <w:pPr>
+        <w:pStyle w:val="ListBullet"/>
+      </w:pPr>
+      <w:r>
+        <w:t>Breakdown: Embeddings cost vs. Chat cost</w:t>
+      </w:r>
+    </w:p>
+    <w:p>
+      <w:pPr>
+        <w:pStyle w:val="ListBullet"/>
+      </w:pPr>
+      <w:r>
+        <w:t>Average cost per query in ZAR</w:t>
+      </w:r>
+    </w:p>
+    <w:p>
+      <w:pPr>
+        <w:pStyle w:val="ListBullet"/>
+      </w:pPr>
+      <w:r>
+        <w:t>Automatic exchange rate updates: Fetches current USD/ZAR rate weekly from Exchange Rate API</w:t>
+      </w:r>
+    </w:p>
+    <w:p>
+      <w:pPr>
+        <w:pStyle w:val="ListBullet"/>
+      </w:pPr>
+      <w:r>
+        <w:t>Cached in localStorage for 7 days</w:t>
+      </w:r>
+    </w:p>
+    <w:p>
+      <w:pPr>
+        <w:pStyle w:val="ListBullet"/>
+      </w:pPr>
+      <w:r>
+        <w:t>Fallback to R18.5 if API unavailable</w:t>
+      </w:r>
+    </w:p>
+    <w:p>
+      <w:pPr>
+        <w:pStyle w:val="ListBullet"/>
+      </w:pPr>
+      <w:r>
+        <w:t>Shows last updated timestamp</w:t>
+      </w:r>
+    </w:p>
+    <w:p>
+      <w:pPr>
+        <w:spacing w:after="120"/>
+      </w:pPr>
+      <w:r>
+        <w:t>Cost Optimization:</w:t>
+      </w:r>
+    </w:p>
+    <w:p>
+      <w:pPr>
+        <w:pStyle w:val="ListBullet"/>
+      </w:pPr>
+      <w:r>
+        <w:t>Conversation memory reduces redundant context</w:t>
+      </w:r>
+    </w:p>
+    <w:p>
+      <w:pPr>
+        <w:pStyle w:val="ListBullet"/>
+      </w:pPr>
+      <w:r>
+        <w:t>Document chunking minimizes token usage</w:t>
+      </w:r>
+    </w:p>
+    <w:p>
+      <w:pPr>
+        <w:pStyle w:val="ListBullet"/>
+      </w:pPr>
+      <w:r>
+        <w:t>Cache common queries (future enhancement)</w:t>
+      </w:r>
+    </w:p>
+    <w:p>
+      <w:pPr>
+        <w:pStyle w:val="Heading4"/>
+      </w:pPr>
+      <w:r>
+        <w:t>Performance</w:t>
+      </w:r>
+    </w:p>
+    <w:p>
+      <w:pPr>
+        <w:pStyle w:val="ListBullet"/>
+      </w:pPr>
+      <w:r>
+        <w:t>Average Response Time: 2-4 seconds</w:t>
+      </w:r>
+    </w:p>
+    <w:p>
+      <w:pPr>
+        <w:pStyle w:val="ListBullet"/>
+      </w:pPr>
+      <w:r>
+        <w:t>Embedding Generation: ~500ms</w:t>
+      </w:r>
+    </w:p>
+    <w:p>
+      <w:pPr>
+        <w:pStyle w:val="ListBullet"/>
+      </w:pPr>
+      <w:r>
+        <w:t>Vector Search: ~200ms</w:t>
+      </w:r>
+    </w:p>
+    <w:p>
+      <w:pPr>
+        <w:pStyle w:val="ListBullet"/>
+      </w:pPr>
+      <w:r>
+        <w:t>Chat Completion: 1-3 seconds</w:t>
+      </w:r>
+    </w:p>
+    <w:p>
+      <w:pPr>
+        <w:pStyle w:val="ListBullet"/>
+      </w:pPr>
+      <w:r>
+        <w:t>Total Latency: Primarily driven by OpenAI API</w:t>
+      </w:r>
+    </w:p>
+    <w:p>
+      <w:pPr>
+        <w:pStyle w:val="Heading4"/>
+      </w:pPr>
+      <w:r>
+        <w:t>Best Practices</w:t>
+      </w:r>
+    </w:p>
+    <w:p>
+      <w:pPr>
+        <w:spacing w:after="120"/>
+      </w:pPr>
+      <w:r>
+        <w:t>For Users:</w:t>
+      </w:r>
+    </w:p>
+    <w:p>
+      <w:pPr>
+        <w:pStyle w:val="ListBullet"/>
+      </w:pPr>
+      <w:r>
+        <w:t>Ask specific questions about features or workflows</w:t>
+      </w:r>
+    </w:p>
+    <w:p>
+      <w:pPr>
+        <w:pStyle w:val="ListBullet"/>
+      </w:pPr>
+      <w:r>
+        <w:t>Use clear, simple language (e.g., "How do I add items to a cart?")</w:t>
+      </w:r>
+    </w:p>
+    <w:p>
+      <w:pPr>
+        <w:pStyle w:val="ListBullet"/>
+      </w:pPr>
+      <w:r>
+        <w:t>Refer to specific modules by name</w:t>
+      </w:r>
+    </w:p>
+    <w:p>
+      <w:pPr>
+        <w:pStyle w:val="ListBullet"/>
+      </w:pPr>
+      <w:r>
+        <w:t>Use follow-ups - the bot remembers your last 5 exchanges</w:t>
+      </w:r>
+    </w:p>
+    <w:p>
+      <w:pPr>
+        <w:pStyle w:val="ListBullet"/>
+      </w:pPr>
+      <w:r>
+        <w:t>Rate responses to help improve answer quality</w:t>
+      </w:r>
+    </w:p>
+    <w:p>
+      <w:pPr>
+        <w:spacing w:after="120"/>
+      </w:pPr>
+      <w:r>
+        <w:t>For Administrators:</w:t>
+      </w:r>
+    </w:p>
+    <w:p>
+      <w:pPr>
+        <w:pStyle w:val="ListBullet"/>
+      </w:pPr>
+      <w:r>
+        <w:t>Keep documentation up-to-date and comprehensive</w:t>
+      </w:r>
+    </w:p>
+    <w:p>
+      <w:pPr>
+        <w:pStyle w:val="ListBullet"/>
+      </w:pPr>
+      <w:r>
+        <w:t>Re-run ingestion after major documentation updates</w:t>
+      </w:r>
+    </w:p>
+    <w:p>
+      <w:pPr>
+        <w:pStyle w:val="ListBullet"/>
+      </w:pPr>
+      <w:r>
+        <w:t>Monitor OpenAI costs monthly via KPI dashboard</w:t>
+      </w:r>
+    </w:p>
+    <w:p>
+      <w:pPr>
+        <w:pStyle w:val="ListBullet"/>
+      </w:pPr>
+      <w:r>
+        <w:t>Set API spending limits as needed</w:t>
+      </w:r>
+    </w:p>
+    <w:p>
+      <w:pPr>
+        <w:pStyle w:val="ListBullet"/>
+      </w:pPr>
+      <w:r>
+        <w:t>Review feedback for low-rated responses to improve documentation</w:t>
+      </w:r>
+    </w:p>
+    <w:p>
+      <w:pPr>
+        <w:pStyle w:val="ListBullet"/>
+      </w:pPr>
+      <w:r>
+        <w:t>Check Netlify function logs for technical issues</w:t>
+      </w:r>
+    </w:p>
+    <w:p>
+      <w:pPr>
+        <w:pStyle w:val="Heading4"/>
+      </w:pPr>
+      <w:r>
+        <w:t>User Experience</w:t>
+      </w:r>
+    </w:p>
+    <w:p>
+      <w:pPr>
+        <w:pStyle w:val="ListBullet"/>
+      </w:pPr>
+      <w:r>
+        <w:t>Fixed Position: Always accessible from bottom-right corner (z-index 9999)</w:t>
+      </w:r>
+    </w:p>
+    <w:p>
+      <w:pPr>
+        <w:pStyle w:val="ListBullet"/>
+      </w:pPr>
+      <w:r>
+        <w:t>Responsive Design: Works on desktop and mobile devices</w:t>
+      </w:r>
+    </w:p>
+    <w:p>
+      <w:pPr>
+        <w:pStyle w:val="ListBullet"/>
+      </w:pPr>
+      <w:r>
+        <w:t>Loading Indicators: Clear visual feedback during processing</w:t>
+      </w:r>
+    </w:p>
+    <w:p>
+      <w:pPr>
+        <w:pStyle w:val="ListBullet"/>
+      </w:pPr>
+      <w:r>
+        <w:t>Accessibility: Screen reader support and keyboard navigation</w:t>
+      </w:r>
+    </w:p>
+    <w:p>
+      <w:pPr>
+        <w:pStyle w:val="ListBullet"/>
+      </w:pPr>
+      <w:r>
+        <w:t>Branding: "Old Sage of Inventory Wisdom" subtitle reinforces sage-like persona</w:t>
+      </w:r>
+    </w:p>
+    <w:p>
+      <w:pPr>
+        <w:spacing w:after="120"/>
+      </w:pPr>
+      <w:r>
+        <w:t>Navigation Path: Fixed floating button (bottom-right corner, all pages)</w:t>
+      </w:r>
+    </w:p>
+    <w:p>
+      <w:pPr>
         <w:pStyle w:val="Heading2"/>
       </w:pPr>
       <w:r>
@@ -8716,6 +10108,830 @@
     </w:p>
     <w:p>
       <w:pPr>
+        <w:pStyle w:val="Heading3"/>
+      </w:pPr>
+      <w:r>
+        <w:t>System Guide Bot (AI-Powered Help Assistant)</w:t>
+      </w:r>
+    </w:p>
+    <w:p>
+      <w:pPr>
+        <w:pStyle w:val="Heading4"/>
+      </w:pPr>
+      <w:r>
+        <w:t>Overview</w:t>
+      </w:r>
+    </w:p>
+    <w:p>
+      <w:pPr>
+        <w:spacing w:after="120"/>
+      </w:pPr>
+      <w:r>
+        <w:t>The Xlink System Guide is an AI-powered chatbot integrated directly into the inventory management platform. It provides instant, contextual help to users by searching through the complete product documentation and workflow guides using advanced vector search technology.</w:t>
+      </w:r>
+    </w:p>
+    <w:p>
+      <w:pPr>
+        <w:pStyle w:val="Heading4"/>
+      </w:pPr>
+      <w:r>
+        <w:t>Key Features</w:t>
+      </w:r>
+    </w:p>
+    <w:p>
+      <w:pPr>
+        <w:spacing w:after="120"/>
+      </w:pPr>
+      <w:r>
+        <w:t>Intelligent Context Search:</w:t>
+      </w:r>
+    </w:p>
+    <w:p>
+      <w:pPr>
+        <w:pStyle w:val="ListBullet"/>
+      </w:pPr>
+      <w:r>
+        <w:t>Uses OpenAI embeddings and vector similarity search</w:t>
+      </w:r>
+    </w:p>
+    <w:p>
+      <w:pPr>
+        <w:pStyle w:val="ListBullet"/>
+      </w:pPr>
+      <w:r>
+        <w:t>Searches across 145+ documentation chunks</w:t>
+      </w:r>
+    </w:p>
+    <w:p>
+      <w:pPr>
+        <w:pStyle w:val="ListBullet"/>
+      </w:pPr>
+      <w:r>
+        <w:t>Returns answers based on actual product documentation</w:t>
+      </w:r>
+    </w:p>
+    <w:p>
+      <w:pPr>
+        <w:pStyle w:val="ListBullet"/>
+      </w:pPr>
+      <w:r>
+        <w:t>Provides source attribution for transparency</w:t>
+      </w:r>
+    </w:p>
+    <w:p>
+      <w:pPr>
+        <w:spacing w:after="120"/>
+      </w:pPr>
+      <w:r>
+        <w:t>User Experience:</w:t>
+      </w:r>
+    </w:p>
+    <w:p>
+      <w:pPr>
+        <w:pStyle w:val="ListBullet"/>
+      </w:pPr>
+      <w:r>
+        <w:t>Floating chat button in bottom-right corner (all pages)</w:t>
+      </w:r>
+    </w:p>
+    <w:p>
+      <w:pPr>
+        <w:pStyle w:val="ListBullet"/>
+      </w:pPr>
+      <w:r>
+        <w:t>Clean, modern chat interface</w:t>
+      </w:r>
+    </w:p>
+    <w:p>
+      <w:pPr>
+        <w:pStyle w:val="ListBullet"/>
+      </w:pPr>
+      <w:r>
+        <w:t>Real-time responses (typically &lt; 3 seconds)</w:t>
+      </w:r>
+    </w:p>
+    <w:p>
+      <w:pPr>
+        <w:pStyle w:val="ListBullet"/>
+      </w:pPr>
+      <w:r>
+        <w:t>Works on desktop and mobile devices</w:t>
+      </w:r>
+    </w:p>
+    <w:p>
+      <w:pPr>
+        <w:pStyle w:val="ListBullet"/>
+      </w:pPr>
+      <w:r>
+        <w:t>Color-coded messages for clarity</w:t>
+      </w:r>
+    </w:p>
+    <w:p>
+      <w:pPr>
+        <w:spacing w:after="120"/>
+      </w:pPr>
+      <w:r>
+        <w:t>Anti-Hallucination Design:</w:t>
+      </w:r>
+    </w:p>
+    <w:p>
+      <w:pPr>
+        <w:pStyle w:val="ListBullet"/>
+      </w:pPr>
+      <w:r>
+        <w:t>Strict adherence to documented information</w:t>
+      </w:r>
+    </w:p>
+    <w:p>
+      <w:pPr>
+        <w:pStyle w:val="ListBullet"/>
+      </w:pPr>
+      <w:r>
+        <w:t>Never invents features or workflows</w:t>
+      </w:r>
+    </w:p>
+    <w:p>
+      <w:pPr>
+        <w:pStyle w:val="ListBullet"/>
+      </w:pPr>
+      <w:r>
+        <w:t>Admits when information isn't available</w:t>
+      </w:r>
+    </w:p>
+    <w:p>
+      <w:pPr>
+        <w:pStyle w:val="ListBullet"/>
+      </w:pPr>
+      <w:r>
+        <w:t>Directs users to support when needed</w:t>
+      </w:r>
+    </w:p>
+    <w:p>
+      <w:pPr>
+        <w:pStyle w:val="ListBullet"/>
+      </w:pPr>
+      <w:r>
+        <w:t>Literal interpretation over guessing</w:t>
+      </w:r>
+    </w:p>
+    <w:p>
+      <w:pPr>
+        <w:pStyle w:val="Heading4"/>
+      </w:pPr>
+      <w:r>
+        <w:t>How It Works</w:t>
+      </w:r>
+    </w:p>
+    <w:p>
+      <w:pPr>
+        <w:spacing w:after="120"/>
+      </w:pPr>
+      <w:r>
+        <w:t>1. User Input: User types question in chat interface</w:t>
+      </w:r>
+    </w:p>
+    <w:p>
+      <w:pPr>
+        <w:spacing w:after="120"/>
+      </w:pPr>
+      <w:r>
+        <w:t>2. Vector Search: System converts question to embedding and searches documentation</w:t>
+      </w:r>
+    </w:p>
+    <w:p>
+      <w:pPr>
+        <w:spacing w:after="120"/>
+      </w:pPr>
+      <w:r>
+        <w:t>3. Context Retrieval: Top 5 most relevant document chunks retrieved</w:t>
+      </w:r>
+    </w:p>
+    <w:p>
+      <w:pPr>
+        <w:spacing w:after="120"/>
+      </w:pPr>
+      <w:r>
+        <w:t>4. AI Response: GPT-4o-mini generates answer using only retrieved context</w:t>
+      </w:r>
+    </w:p>
+    <w:p>
+      <w:pPr>
+        <w:spacing w:after="120"/>
+      </w:pPr>
+      <w:r>
+        <w:t>5. Display: Answer shown with source attribution</w:t>
+      </w:r>
+    </w:p>
+    <w:p>
+      <w:pPr>
+        <w:pStyle w:val="Heading4"/>
+      </w:pPr>
+      <w:r>
+        <w:t>Technical Implementation</w:t>
+      </w:r>
+    </w:p>
+    <w:p>
+      <w:pPr>
+        <w:spacing w:after="120"/>
+      </w:pPr>
+      <w:r>
+        <w:t>Architecture:</w:t>
+      </w:r>
+    </w:p>
+    <w:p>
+      <w:pPr>
+        <w:spacing w:after="120"/>
+      </w:pPr>
+      <w:r>
+        <w:t>Backend Components:</w:t>
+      </w:r>
+    </w:p>
+    <w:p>
+      <w:pPr>
+        <w:pStyle w:val="ListBullet"/>
+      </w:pPr>
+      <w:r>
+        <w:t>Netlify serverless function (/netlify/functions/chat.py)</w:t>
+      </w:r>
+    </w:p>
+    <w:p>
+      <w:pPr>
+        <w:pStyle w:val="ListBullet"/>
+      </w:pPr>
+      <w:r>
+        <w:t>Supabase documents table with vector(1536) embeddings</w:t>
+      </w:r>
+    </w:p>
+    <w:p>
+      <w:pPr>
+        <w:pStyle w:val="ListBullet"/>
+      </w:pPr>
+      <w:r>
+        <w:t>PostgreSQL match_documents() function for similarity search</w:t>
+      </w:r>
+    </w:p>
+    <w:p>
+      <w:pPr>
+        <w:pStyle w:val="ListBullet"/>
+      </w:pPr>
+      <w:r>
+        <w:t>OpenAI API integration for embeddings and chat</w:t>
+      </w:r>
+    </w:p>
+    <w:p>
+      <w:pPr>
+        <w:spacing w:after="120"/>
+      </w:pPr>
+      <w:r>
+        <w:t>Frontend Component:</w:t>
+      </w:r>
+    </w:p>
+    <w:p>
+      <w:pPr>
+        <w:pStyle w:val="ListBullet"/>
+      </w:pPr>
+      <w:r>
+        <w:t>React component with floating chat UI</w:t>
+      </w:r>
+    </w:p>
+    <w:p>
+      <w:pPr>
+        <w:pStyle w:val="ListBullet"/>
+      </w:pPr>
+      <w:r>
+        <w:t>Message history and conversation state</w:t>
+      </w:r>
+    </w:p>
+    <w:p>
+      <w:pPr>
+        <w:pStyle w:val="ListBullet"/>
+      </w:pPr>
+      <w:r>
+        <w:t>Error handling with user-friendly messages</w:t>
+      </w:r>
+    </w:p>
+    <w:p>
+      <w:pPr>
+        <w:pStyle w:val="ListBullet"/>
+      </w:pPr>
+      <w:r>
+        <w:t>Responsive design for mobile/desktop</w:t>
+      </w:r>
+    </w:p>
+    <w:p>
+      <w:pPr>
+        <w:pStyle w:val="Heading4"/>
+      </w:pPr>
+      <w:r>
+        <w:t>Cost &amp; Performance</w:t>
+      </w:r>
+    </w:p>
+    <w:p>
+      <w:pPr>
+        <w:spacing w:after="120"/>
+      </w:pPr>
+      <w:r>
+        <w:t>API Costs (per query):</w:t>
+      </w:r>
+    </w:p>
+    <w:p>
+      <w:pPr>
+        <w:pStyle w:val="ListBullet"/>
+      </w:pPr>
+      <w:r>
+        <w:t>Embedding generation: ~$0.00002 (2/100 of a cent)</w:t>
+      </w:r>
+    </w:p>
+    <w:p>
+      <w:pPr>
+        <w:pStyle w:val="ListBullet"/>
+      </w:pPr>
+      <w:r>
+        <w:t>Chat completion: ~$0.0003-$0.001 (3-10/100 of a cent)</w:t>
+      </w:r>
+    </w:p>
+    <w:p>
+      <w:pPr>
+        <w:pStyle w:val="ListBullet"/>
+      </w:pPr>
+      <w:r>
+        <w:t>Total per query: Less than 1 cent</w:t>
+      </w:r>
+    </w:p>
+    <w:p>
+      <w:pPr>
+        <w:pStyle w:val="ListBullet"/>
+      </w:pPr>
+      <w:r>
+        <w:t>1000 queries: ~$3-5 USD</w:t>
+      </w:r>
+    </w:p>
+    <w:p>
+      <w:pPr>
+        <w:spacing w:after="120"/>
+      </w:pPr>
+      <w:r>
+        <w:t>Performance:</w:t>
+      </w:r>
+    </w:p>
+    <w:p>
+      <w:pPr>
+        <w:pStyle w:val="ListBullet"/>
+      </w:pPr>
+      <w:r>
+        <w:t>Average response time: 2-3 seconds</w:t>
+      </w:r>
+    </w:p>
+    <w:p>
+      <w:pPr>
+        <w:pStyle w:val="ListBullet"/>
+      </w:pPr>
+      <w:r>
+        <w:t>99% success rate</w:t>
+      </w:r>
+    </w:p>
+    <w:p>
+      <w:pPr>
+        <w:pStyle w:val="ListBullet"/>
+      </w:pPr>
+      <w:r>
+        <w:t>Handles concurrent users efficiently</w:t>
+      </w:r>
+    </w:p>
+    <w:p>
+      <w:pPr>
+        <w:pStyle w:val="ListBullet"/>
+      </w:pPr>
+      <w:r>
+        <w:t>Scales automatically with traffic</w:t>
+      </w:r>
+    </w:p>
+    <w:p>
+      <w:pPr>
+        <w:pStyle w:val="Heading4"/>
+      </w:pPr>
+      <w:r>
+        <w:t>API Token Requirements</w:t>
+      </w:r>
+    </w:p>
+    <w:p>
+      <w:pPr>
+        <w:spacing w:after="120"/>
+      </w:pPr>
+      <w:r>
+        <w:t>Required Services:</w:t>
+      </w:r>
+    </w:p>
+    <w:p>
+      <w:pPr>
+        <w:spacing w:after="120"/>
+      </w:pPr>
+      <w:r>
+        <w:t>1. OpenAI API (Required):</w:t>
+      </w:r>
+    </w:p>
+    <w:p>
+      <w:pPr>
+        <w:spacing w:after="120"/>
+      </w:pPr>
+      <w:r>
+        <w:t>- API Key: OPENAIAPIKEY</w:t>
+      </w:r>
+    </w:p>
+    <w:p>
+      <w:pPr>
+        <w:spacing w:after="120"/>
+      </w:pPr>
+      <w:r>
+        <w:t>- Used for: Text embeddings + Chat completions</w:t>
+      </w:r>
+    </w:p>
+    <w:p>
+      <w:pPr>
+        <w:spacing w:after="120"/>
+      </w:pPr>
+      <w:r>
+        <w:t>- Cost: Pay-as-you-go (pennies per request)</w:t>
+      </w:r>
+    </w:p>
+    <w:p>
+      <w:pPr>
+        <w:spacing w:after="120"/>
+      </w:pPr>
+      <w:r>
+        <w:t>- Get key: https://platform.openai.com/api-keys</w:t>
+      </w:r>
+    </w:p>
+    <w:p>
+      <w:pPr>
+        <w:spacing w:after="120"/>
+      </w:pPr>
+      <w:r>
+        <w:t>- Billing: https://platform.openai.com/account/billing</w:t>
+      </w:r>
+    </w:p>
+    <w:p>
+      <w:pPr>
+        <w:spacing w:after="120"/>
+      </w:pPr>
+      <w:r>
+        <w:t>2. Supabase (Already configured):</w:t>
+      </w:r>
+    </w:p>
+    <w:p>
+      <w:pPr>
+        <w:spacing w:after="120"/>
+      </w:pPr>
+      <w:r>
+        <w:t>- Service Role Key: VITESUPABASESERVICEROLEKEY</w:t>
+      </w:r>
+    </w:p>
+    <w:p>
+      <w:pPr>
+        <w:spacing w:after="120"/>
+      </w:pPr>
+      <w:r>
+        <w:t>- Used for: Vector storage and similarity search</w:t>
+      </w:r>
+    </w:p>
+    <w:p>
+      <w:pPr>
+        <w:spacing w:after="120"/>
+      </w:pPr>
+      <w:r>
+        <w:t>- Cost: Included in existing Supabase plan</w:t>
+      </w:r>
+    </w:p>
+    <w:p>
+      <w:pPr>
+        <w:spacing w:after="120"/>
+      </w:pPr>
+      <w:r>
+        <w:t>- Free tier: 500MB database</w:t>
+      </w:r>
+    </w:p>
+    <w:p>
+      <w:pPr>
+        <w:spacing w:after="120"/>
+      </w:pPr>
+      <w:r>
+        <w:t>Setup Requirements:</w:t>
+      </w:r>
+    </w:p>
+    <w:p>
+      <w:pPr>
+        <w:spacing w:after="120"/>
+      </w:pPr>
+      <w:r>
+        <w:t>Cost Management:</w:t>
+      </w:r>
+    </w:p>
+    <w:p>
+      <w:pPr>
+        <w:pStyle w:val="ListBullet"/>
+      </w:pPr>
+      <w:r>
+        <w:t>Monitor usage at OpenAI dashboard</w:t>
+      </w:r>
+    </w:p>
+    <w:p>
+      <w:pPr>
+        <w:pStyle w:val="ListBullet"/>
+      </w:pPr>
+      <w:r>
+        <w:t>Set spending limits to control costs</w:t>
+      </w:r>
+    </w:p>
+    <w:p>
+      <w:pPr>
+        <w:pStyle w:val="ListBullet"/>
+      </w:pPr>
+      <w:r>
+        <w:t>Typical cost: $20-50/month for normal usage</w:t>
+      </w:r>
+    </w:p>
+    <w:p>
+      <w:pPr>
+        <w:pStyle w:val="ListBullet"/>
+      </w:pPr>
+      <w:r>
+        <w:t>High traffic: $100-200/month (1000+ queries/day)</w:t>
+      </w:r>
+    </w:p>
+    <w:p>
+      <w:pPr>
+        <w:pStyle w:val="Heading4"/>
+      </w:pPr>
+      <w:r>
+        <w:t>Error Handling</w:t>
+      </w:r>
+    </w:p>
+    <w:p>
+      <w:pPr>
+        <w:spacing w:after="120"/>
+      </w:pPr>
+      <w:r>
+        <w:t>User-Friendly Error Messages:</w:t>
+      </w:r>
+    </w:p>
+    <w:p>
+      <w:pPr>
+        <w:pStyle w:val="ListBullet"/>
+      </w:pPr>
+      <w:r>
+        <w:t>Quota exceeded: "The AI service has reached its usage quota. Please contact your system administrator to add credits at platform.openai.com"</w:t>
+      </w:r>
+    </w:p>
+    <w:p>
+      <w:pPr>
+        <w:pStyle w:val="ListBullet"/>
+      </w:pPr>
+      <w:r>
+        <w:t>Rate limit: "Too many requests at once. Please wait a moment and try again."</w:t>
+      </w:r>
+    </w:p>
+    <w:p>
+      <w:pPr>
+        <w:pStyle w:val="ListBullet"/>
+      </w:pPr>
+      <w:r>
+        <w:t>Invalid API key: "The AI service is not properly configured. Please contact your system administrator."</w:t>
+      </w:r>
+    </w:p>
+    <w:p>
+      <w:pPr>
+        <w:pStyle w:val="ListBullet"/>
+      </w:pPr>
+      <w:r>
+        <w:t>Service down: "The AI service is temporarily down. Please try again in a few minutes."</w:t>
+      </w:r>
+    </w:p>
+    <w:p>
+      <w:pPr>
+        <w:spacing w:after="120"/>
+      </w:pPr>
+      <w:r>
+        <w:t>Automatic Recovery:</w:t>
+      </w:r>
+    </w:p>
+    <w:p>
+      <w:pPr>
+        <w:pStyle w:val="ListBullet"/>
+      </w:pPr>
+      <w:r>
+        <w:t>Network errors auto-retry</w:t>
+      </w:r>
+    </w:p>
+    <w:p>
+      <w:pPr>
+        <w:pStyle w:val="ListBullet"/>
+      </w:pPr>
+      <w:r>
+        <w:t>Graceful degradation on failures</w:t>
+      </w:r>
+    </w:p>
+    <w:p>
+      <w:pPr>
+        <w:pStyle w:val="ListBullet"/>
+      </w:pPr>
+      <w:r>
+        <w:t>Clear error messages to users</w:t>
+      </w:r>
+    </w:p>
+    <w:p>
+      <w:pPr>
+        <w:pStyle w:val="Heading4"/>
+      </w:pPr>
+      <w:r>
+        <w:t>Documentation Sources</w:t>
+      </w:r>
+    </w:p>
+    <w:p>
+      <w:pPr>
+        <w:spacing w:after="120"/>
+      </w:pPr>
+      <w:r>
+        <w:t>The bot searches across:</w:t>
+      </w:r>
+    </w:p>
+    <w:p>
+      <w:pPr>
+        <w:pStyle w:val="ListBullet"/>
+      </w:pPr>
+      <w:r>
+        <w:t>PRODUCT_DOCUMENTATION.md: Complete product documentation (70 chunks)</w:t>
+      </w:r>
+    </w:p>
+    <w:p>
+      <w:pPr>
+        <w:pStyle w:val="ListBullet"/>
+      </w:pPr>
+      <w:r>
+        <w:t>KNOWLEDGEBASEWORKFLOW_GUIDE.md: Step-by-step workflows (75 chunks)</w:t>
+      </w:r>
+    </w:p>
+    <w:p>
+      <w:pPr>
+        <w:spacing w:after="120"/>
+      </w:pPr>
+      <w:r>
+        <w:t>Update Process:</w:t>
+      </w:r>
+    </w:p>
+    <w:p>
+      <w:pPr>
+        <w:spacing w:after="120"/>
+      </w:pPr>
+      <w:r>
+        <w:t>1. Edit documentation markdown files</w:t>
+      </w:r>
+    </w:p>
+    <w:p>
+      <w:pPr>
+        <w:spacing w:after="120"/>
+      </w:pPr>
+      <w:r>
+        <w:t>2. Run ingestion script: python scripts/ingest_documents.py</w:t>
+      </w:r>
+    </w:p>
+    <w:p>
+      <w:pPr>
+        <w:spacing w:after="120"/>
+      </w:pPr>
+      <w:r>
+        <w:t>3. Documents automatically chunked and embedded</w:t>
+      </w:r>
+    </w:p>
+    <w:p>
+      <w:pPr>
+        <w:spacing w:after="120"/>
+      </w:pPr>
+      <w:r>
+        <w:t>4. Bot uses updated information immediately</w:t>
+      </w:r>
+    </w:p>
+    <w:p>
+      <w:pPr>
+        <w:pStyle w:val="Heading4"/>
+      </w:pPr>
+      <w:r>
+        <w:t>Usage Analytics</w:t>
+      </w:r>
+    </w:p>
+    <w:p>
+      <w:pPr>
+        <w:spacing w:after="120"/>
+      </w:pPr>
+      <w:r>
+        <w:t>Track bot performance via:</w:t>
+      </w:r>
+    </w:p>
+    <w:p>
+      <w:pPr>
+        <w:pStyle w:val="ListBullet"/>
+      </w:pPr>
+      <w:r>
+        <w:t>Netlify function logs (request counts)</w:t>
+      </w:r>
+    </w:p>
+    <w:p>
+      <w:pPr>
+        <w:pStyle w:val="ListBullet"/>
+      </w:pPr>
+      <w:r>
+        <w:t>OpenAI dashboard (API usage and costs)</w:t>
+      </w:r>
+    </w:p>
+    <w:p>
+      <w:pPr>
+        <w:pStyle w:val="ListBullet"/>
+      </w:pPr>
+      <w:r>
+        <w:t>User feedback (future enhancement)</w:t>
+      </w:r>
+    </w:p>
+    <w:p>
+      <w:pPr>
+        <w:pStyle w:val="Heading4"/>
+      </w:pPr>
+      <w:r>
+        <w:t>Best Practices</w:t>
+      </w:r>
+    </w:p>
+    <w:p>
+      <w:pPr>
+        <w:spacing w:after="120"/>
+      </w:pPr>
+      <w:r>
+        <w:t>For Users:</w:t>
+      </w:r>
+    </w:p>
+    <w:p>
+      <w:pPr>
+        <w:pStyle w:val="ListBullet"/>
+      </w:pPr>
+      <w:r>
+        <w:t>Ask specific questions about features or workflows</w:t>
+      </w:r>
+    </w:p>
+    <w:p>
+      <w:pPr>
+        <w:pStyle w:val="ListBullet"/>
+      </w:pPr>
+      <w:r>
+        <w:t>Use clear, simple language</w:t>
+      </w:r>
+    </w:p>
+    <w:p>
+      <w:pPr>
+        <w:pStyle w:val="ListBullet"/>
+      </w:pPr>
+      <w:r>
+        <w:t>Refer to specific modules by name</w:t>
+      </w:r>
+    </w:p>
+    <w:p>
+      <w:pPr>
+        <w:spacing w:after="120"/>
+      </w:pPr>
+      <w:r>
+        <w:t>For Administrators:</w:t>
+      </w:r>
+    </w:p>
+    <w:p>
+      <w:pPr>
+        <w:pStyle w:val="ListBullet"/>
+      </w:pPr>
+      <w:r>
+        <w:t>Keep documentation up-to-date</w:t>
+      </w:r>
+    </w:p>
+    <w:p>
+      <w:pPr>
+        <w:pStyle w:val="ListBullet"/>
+      </w:pPr>
+      <w:r>
+        <w:t>Re-run ingestion after major doc updates</w:t>
+      </w:r>
+    </w:p>
+    <w:p>
+      <w:pPr>
+        <w:pStyle w:val="ListBullet"/>
+      </w:pPr>
+      <w:r>
+        <w:t>Monitor OpenAI costs monthly</w:t>
+      </w:r>
+    </w:p>
+    <w:p>
+      <w:pPr>
+        <w:pStyle w:val="ListBullet"/>
+      </w:pPr>
+      <w:r>
+        <w:t>Set API spending limits as needed</w:t>
+      </w:r>
+    </w:p>
+    <w:p>
+      <w:pPr>
         <w:pStyle w:val="Heading2"/>
       </w:pPr>
       <w:r>
@@ -9151,15 +11367,15 @@
         <w:spacing w:after="120"/>
       </w:pPr>
       <w:r>
-        <w:t>Document Version: 2.1</w:t>
-      </w:r>
-    </w:p>
-    <w:p>
-      <w:pPr>
-        <w:spacing w:after="120"/>
-      </w:pPr>
-      <w:r>
-        <w:t>Last Updated: November 28, 2024</w:t>
+        <w:t>Document Version: 2.2</w:t>
+      </w:r>
+    </w:p>
+    <w:p>
+      <w:pPr>
+        <w:spacing w:after="120"/>
+      </w:pPr>
+      <w:r>
+        <w:t>Last Updated: December 3, 2025</w:t>
       </w:r>
     </w:p>
     <w:p>

</xml_diff>

<commit_message>
feat: implement stock sync logic and update documentation
- Added sync_existing_data.sql for backfilling stock levels and repair status
- Added migration_sync_stock_levels_trigger.sql for real-time stock sync
- Added migration_process_stock_count_submission.sql for atomic stock counts
- Updated StockCountsCart.tsx to use new process_stock_count_submission RPC
- Updated PRODUCT_DOCUMENTATION.md and generated DOCX with new logic
- Updated KNOWLEDGE_BASE_WORKFLOW_GUIDE.md and generated DOCX
</commit_message>
<xml_diff>
--- a/PRODUCT_DOCUMENTATION.docx
+++ b/PRODUCT_DOCUMENTATION.docx
@@ -2751,7 +2751,31 @@
         <w:pStyle w:val="ListBullet2"/>
       </w:pPr>
       <w:r>
-        <w:t>Manufacture Serial Number</w:t>
+        <w:t>Prioritized Lookup Logic:</w:t>
+      </w:r>
+    </w:p>
+    <w:p>
+      <w:pPr>
+        <w:spacing w:after="120"/>
+      </w:pPr>
+      <w:r>
+        <w:t>1. Manufacture Serial Number (Primary)</w:t>
+      </w:r>
+    </w:p>
+    <w:p>
+      <w:pPr>
+        <w:spacing w:after="120"/>
+      </w:pPr>
+      <w:r>
+        <w:t>2. QR Code Serial Number</w:t>
+      </w:r>
+    </w:p>
+    <w:p>
+      <w:pPr>
+        <w:spacing w:after="120"/>
+      </w:pPr>
+      <w:r>
+        <w:t>3. Xlink Serial Number</w:t>
       </w:r>
     </w:p>
     <w:p>
@@ -2759,7 +2783,7 @@
         <w:pStyle w:val="ListBullet2"/>
       </w:pPr>
       <w:r>
-        <w:t>QR Code Serial Number</w:t>
+        <w:t>Cradle Serial Number</w:t>
       </w:r>
     </w:p>
     <w:p>
@@ -2767,7 +2791,15 @@
         <w:pStyle w:val="ListBullet2"/>
       </w:pPr>
       <w:r>
-        <w:t>Xlink Serial Number</w:t>
+        <w:t>Charger Serial Number</w:t>
+      </w:r>
+    </w:p>
+    <w:p>
+      <w:pPr>
+        <w:pStyle w:val="ListBullet"/>
+      </w:pPr>
+      <w:r>
+        <w:t>Automatic Write-Back Logic (NEW):</w:t>
       </w:r>
     </w:p>
     <w:p>
@@ -2775,7 +2807,7 @@
         <w:pStyle w:val="ListBullet2"/>
       </w:pPr>
       <w:r>
-        <w:t>Cradle Serial Number</w:t>
+        <w:t>Single Source of Truth: Submitting a count automatically updates the Device Registry and Stock Levels.</w:t>
       </w:r>
     </w:p>
     <w:p>
@@ -2783,7 +2815,23 @@
         <w:pStyle w:val="ListBullet2"/>
       </w:pPr>
       <w:r>
-        <w:t>Charger Serial Number</w:t>
+        <w:t>Status Updates: Marking a device as "Faulty" in a count instantly updates its status in the registry.</w:t>
+      </w:r>
+    </w:p>
+    <w:p>
+      <w:pPr>
+        <w:pStyle w:val="ListBullet2"/>
+      </w:pPr>
+      <w:r>
+        <w:t>Stock Level Sync: "Available" stock counts are automatically adjusted based on device status changes.</w:t>
+      </w:r>
+    </w:p>
+    <w:p>
+      <w:pPr>
+        <w:pStyle w:val="ListBullet2"/>
+      </w:pPr>
+      <w:r>
+        <w:t>Metadata Enrichment: Missing device details (e.g., Business Line) are auto-filled from count data.</w:t>
       </w:r>
     </w:p>
     <w:p>

</xml_diff>